<commit_message>
updated for better ATS
</commit_message>
<xml_diff>
--- a/Amjad_Masoud_PMP_Resume.docx
+++ b/Amjad_Masoud_PMP_Resume.docx
@@ -15,7 +15,7 @@
           <w:color w:val="1B2A4A"/>
           <w:sz w:val="44"/>
         </w:rPr>
-        <w:t>AMJAD M. MASOUD, PMP</w:t>
+        <w:t>AMJAD M. MASOUD</w:t>
       </w:r>
     </w:p>
     <w:p>
@@ -729,21 +729,7 @@
           <w:color w:val="333333"/>
           <w:sz w:val="20"/>
         </w:rPr>
-        <w:t xml:space="preserve">Drove full project life-cycle from initiation through UAT, applying Agile-Scrum methodology with 2-week sprint </w:t>
-      </w:r>
-      <w:r>
-        <w:rPr>
-          <w:color w:val="333333"/>
-          <w:sz w:val="20"/>
-        </w:rPr>
-        <w:t>cycles</w:t>
-      </w:r>
-      <w:r>
-        <w:rPr>
-          <w:color w:val="333333"/>
-          <w:sz w:val="20"/>
-        </w:rPr>
-        <w:t xml:space="preserve"> to deliver on time and within budget.</w:t>
+        <w:t>Drove full project life-cycle from initiation through UAT, applying Agile-Scrum methodology with 2-week sprint cycles to deliver on time and within budget.</w:t>
       </w:r>
     </w:p>
     <w:p>
@@ -2244,6 +2230,7 @@
         </w:tabs>
         <w:ind w:start="1080" w:hanging="360"/>
       </w:pPr>
+      <w:rPr/>
     </w:lvl>
     <w:lvl w:ilvl="2">
       <w:start w:val="1"/>
@@ -2256,6 +2243,7 @@
         </w:tabs>
         <w:ind w:start="1440" w:hanging="360"/>
       </w:pPr>
+      <w:rPr/>
     </w:lvl>
     <w:lvl w:ilvl="3">
       <w:start w:val="1"/>
@@ -2268,6 +2256,7 @@
         </w:tabs>
         <w:ind w:start="1800" w:hanging="360"/>
       </w:pPr>
+      <w:rPr/>
     </w:lvl>
     <w:lvl w:ilvl="4">
       <w:start w:val="1"/>
@@ -2280,6 +2269,7 @@
         </w:tabs>
         <w:ind w:start="2160" w:hanging="360"/>
       </w:pPr>
+      <w:rPr/>
     </w:lvl>
     <w:lvl w:ilvl="5">
       <w:start w:val="1"/>
@@ -2292,6 +2282,7 @@
         </w:tabs>
         <w:ind w:start="2520" w:hanging="360"/>
       </w:pPr>
+      <w:rPr/>
     </w:lvl>
     <w:lvl w:ilvl="6">
       <w:start w:val="1"/>
@@ -2304,6 +2295,7 @@
         </w:tabs>
         <w:ind w:start="2880" w:hanging="360"/>
       </w:pPr>
+      <w:rPr/>
     </w:lvl>
     <w:lvl w:ilvl="7">
       <w:start w:val="1"/>
@@ -2316,6 +2308,7 @@
         </w:tabs>
         <w:ind w:start="3240" w:hanging="360"/>
       </w:pPr>
+      <w:rPr/>
     </w:lvl>
     <w:lvl w:ilvl="8">
       <w:start w:val="1"/>
@@ -2328,6 +2321,7 @@
         </w:tabs>
         <w:ind w:start="3600" w:hanging="360"/>
       </w:pPr>
+      <w:rPr/>
     </w:lvl>
   </w:abstractNum>
   <w:abstractNum w:abstractNumId="2">
@@ -2357,6 +2351,7 @@
         </w:tabs>
         <w:ind w:start="1080" w:hanging="360"/>
       </w:pPr>
+      <w:rPr/>
     </w:lvl>
     <w:lvl w:ilvl="2">
       <w:start w:val="1"/>
@@ -2369,6 +2364,7 @@
         </w:tabs>
         <w:ind w:start="1440" w:hanging="360"/>
       </w:pPr>
+      <w:rPr/>
     </w:lvl>
     <w:lvl w:ilvl="3">
       <w:start w:val="1"/>
@@ -2381,6 +2377,7 @@
         </w:tabs>
         <w:ind w:start="1800" w:hanging="360"/>
       </w:pPr>
+      <w:rPr/>
     </w:lvl>
     <w:lvl w:ilvl="4">
       <w:start w:val="1"/>
@@ -2393,6 +2390,7 @@
         </w:tabs>
         <w:ind w:start="2160" w:hanging="360"/>
       </w:pPr>
+      <w:rPr/>
     </w:lvl>
     <w:lvl w:ilvl="5">
       <w:start w:val="1"/>
@@ -2405,6 +2403,7 @@
         </w:tabs>
         <w:ind w:start="2520" w:hanging="360"/>
       </w:pPr>
+      <w:rPr/>
     </w:lvl>
     <w:lvl w:ilvl="6">
       <w:start w:val="1"/>
@@ -2417,6 +2416,7 @@
         </w:tabs>
         <w:ind w:start="2880" w:hanging="360"/>
       </w:pPr>
+      <w:rPr/>
     </w:lvl>
     <w:lvl w:ilvl="7">
       <w:start w:val="1"/>
@@ -2429,6 +2429,7 @@
         </w:tabs>
         <w:ind w:start="3240" w:hanging="360"/>
       </w:pPr>
+      <w:rPr/>
     </w:lvl>
     <w:lvl w:ilvl="8">
       <w:start w:val="1"/>
@@ -2441,6 +2442,7 @@
         </w:tabs>
         <w:ind w:start="3600" w:hanging="360"/>
       </w:pPr>
+      <w:rPr/>
     </w:lvl>
   </w:abstractNum>
   <w:abstractNum w:abstractNumId="3">
@@ -2470,6 +2472,7 @@
         </w:tabs>
         <w:ind w:start="1080" w:hanging="360"/>
       </w:pPr>
+      <w:rPr/>
     </w:lvl>
     <w:lvl w:ilvl="2">
       <w:start w:val="1"/>
@@ -2482,6 +2485,7 @@
         </w:tabs>
         <w:ind w:start="1440" w:hanging="360"/>
       </w:pPr>
+      <w:rPr/>
     </w:lvl>
     <w:lvl w:ilvl="3">
       <w:start w:val="1"/>
@@ -2494,6 +2498,7 @@
         </w:tabs>
         <w:ind w:start="1800" w:hanging="360"/>
       </w:pPr>
+      <w:rPr/>
     </w:lvl>
     <w:lvl w:ilvl="4">
       <w:start w:val="1"/>
@@ -2506,6 +2511,7 @@
         </w:tabs>
         <w:ind w:start="2160" w:hanging="360"/>
       </w:pPr>
+      <w:rPr/>
     </w:lvl>
     <w:lvl w:ilvl="5">
       <w:start w:val="1"/>
@@ -2518,6 +2524,7 @@
         </w:tabs>
         <w:ind w:start="2520" w:hanging="360"/>
       </w:pPr>
+      <w:rPr/>
     </w:lvl>
     <w:lvl w:ilvl="6">
       <w:start w:val="1"/>
@@ -2530,6 +2537,7 @@
         </w:tabs>
         <w:ind w:start="2880" w:hanging="360"/>
       </w:pPr>
+      <w:rPr/>
     </w:lvl>
     <w:lvl w:ilvl="7">
       <w:start w:val="1"/>
@@ -2542,6 +2550,7 @@
         </w:tabs>
         <w:ind w:start="3240" w:hanging="360"/>
       </w:pPr>
+      <w:rPr/>
     </w:lvl>
     <w:lvl w:ilvl="8">
       <w:start w:val="1"/>
@@ -2554,6 +2563,7 @@
         </w:tabs>
         <w:ind w:start="3600" w:hanging="360"/>
       </w:pPr>
+      <w:rPr/>
     </w:lvl>
   </w:abstractNum>
   <w:abstractNum w:abstractNumId="4">
@@ -2581,6 +2591,7 @@
         </w:tabs>
         <w:ind w:start="1080" w:hanging="360"/>
       </w:pPr>
+      <w:rPr/>
     </w:lvl>
     <w:lvl w:ilvl="2">
       <w:start w:val="1"/>
@@ -2593,6 +2604,7 @@
         </w:tabs>
         <w:ind w:start="1440" w:hanging="360"/>
       </w:pPr>
+      <w:rPr/>
     </w:lvl>
     <w:lvl w:ilvl="3">
       <w:start w:val="1"/>
@@ -2605,6 +2617,7 @@
         </w:tabs>
         <w:ind w:start="1800" w:hanging="360"/>
       </w:pPr>
+      <w:rPr/>
     </w:lvl>
     <w:lvl w:ilvl="4">
       <w:start w:val="1"/>
@@ -2617,6 +2630,7 @@
         </w:tabs>
         <w:ind w:start="2160" w:hanging="360"/>
       </w:pPr>
+      <w:rPr/>
     </w:lvl>
     <w:lvl w:ilvl="5">
       <w:start w:val="1"/>
@@ -2629,6 +2643,7 @@
         </w:tabs>
         <w:ind w:start="2520" w:hanging="360"/>
       </w:pPr>
+      <w:rPr/>
     </w:lvl>
     <w:lvl w:ilvl="6">
       <w:start w:val="1"/>
@@ -2641,6 +2656,7 @@
         </w:tabs>
         <w:ind w:start="2880" w:hanging="360"/>
       </w:pPr>
+      <w:rPr/>
     </w:lvl>
     <w:lvl w:ilvl="7">
       <w:start w:val="1"/>
@@ -2653,6 +2669,7 @@
         </w:tabs>
         <w:ind w:start="3240" w:hanging="360"/>
       </w:pPr>
+      <w:rPr/>
     </w:lvl>
     <w:lvl w:ilvl="8">
       <w:start w:val="1"/>
@@ -2665,6 +2682,7 @@
         </w:tabs>
         <w:ind w:start="3600" w:hanging="360"/>
       </w:pPr>
+      <w:rPr/>
     </w:lvl>
   </w:abstractNum>
   <w:abstractNum w:abstractNumId="5">
@@ -2692,6 +2710,7 @@
         </w:tabs>
         <w:ind w:start="1080" w:hanging="360"/>
       </w:pPr>
+      <w:rPr/>
     </w:lvl>
     <w:lvl w:ilvl="2">
       <w:start w:val="1"/>
@@ -2704,6 +2723,7 @@
         </w:tabs>
         <w:ind w:start="1440" w:hanging="360"/>
       </w:pPr>
+      <w:rPr/>
     </w:lvl>
     <w:lvl w:ilvl="3">
       <w:start w:val="1"/>
@@ -2716,6 +2736,7 @@
         </w:tabs>
         <w:ind w:start="1800" w:hanging="360"/>
       </w:pPr>
+      <w:rPr/>
     </w:lvl>
     <w:lvl w:ilvl="4">
       <w:start w:val="1"/>
@@ -2728,6 +2749,7 @@
         </w:tabs>
         <w:ind w:start="2160" w:hanging="360"/>
       </w:pPr>
+      <w:rPr/>
     </w:lvl>
     <w:lvl w:ilvl="5">
       <w:start w:val="1"/>
@@ -2740,6 +2762,7 @@
         </w:tabs>
         <w:ind w:start="2520" w:hanging="360"/>
       </w:pPr>
+      <w:rPr/>
     </w:lvl>
     <w:lvl w:ilvl="6">
       <w:start w:val="1"/>
@@ -2752,6 +2775,7 @@
         </w:tabs>
         <w:ind w:start="2880" w:hanging="360"/>
       </w:pPr>
+      <w:rPr/>
     </w:lvl>
     <w:lvl w:ilvl="7">
       <w:start w:val="1"/>
@@ -2764,6 +2788,7 @@
         </w:tabs>
         <w:ind w:start="3240" w:hanging="360"/>
       </w:pPr>
+      <w:rPr/>
     </w:lvl>
     <w:lvl w:ilvl="8">
       <w:start w:val="1"/>
@@ -2776,6 +2801,7 @@
         </w:tabs>
         <w:ind w:start="3600" w:hanging="360"/>
       </w:pPr>
+      <w:rPr/>
     </w:lvl>
   </w:abstractNum>
   <w:abstractNum w:abstractNumId="6">
@@ -2803,6 +2829,7 @@
         </w:tabs>
         <w:ind w:start="1080" w:hanging="360"/>
       </w:pPr>
+      <w:rPr/>
     </w:lvl>
     <w:lvl w:ilvl="2">
       <w:start w:val="1"/>
@@ -2815,6 +2842,7 @@
         </w:tabs>
         <w:ind w:start="1440" w:hanging="360"/>
       </w:pPr>
+      <w:rPr/>
     </w:lvl>
     <w:lvl w:ilvl="3">
       <w:start w:val="1"/>
@@ -2827,6 +2855,7 @@
         </w:tabs>
         <w:ind w:start="1800" w:hanging="360"/>
       </w:pPr>
+      <w:rPr/>
     </w:lvl>
     <w:lvl w:ilvl="4">
       <w:start w:val="1"/>
@@ -2839,6 +2868,7 @@
         </w:tabs>
         <w:ind w:start="2160" w:hanging="360"/>
       </w:pPr>
+      <w:rPr/>
     </w:lvl>
     <w:lvl w:ilvl="5">
       <w:start w:val="1"/>
@@ -2851,6 +2881,7 @@
         </w:tabs>
         <w:ind w:start="2520" w:hanging="360"/>
       </w:pPr>
+      <w:rPr/>
     </w:lvl>
     <w:lvl w:ilvl="6">
       <w:start w:val="1"/>
@@ -2863,6 +2894,7 @@
         </w:tabs>
         <w:ind w:start="2880" w:hanging="360"/>
       </w:pPr>
+      <w:rPr/>
     </w:lvl>
     <w:lvl w:ilvl="7">
       <w:start w:val="1"/>
@@ -2875,6 +2907,7 @@
         </w:tabs>
         <w:ind w:start="3240" w:hanging="360"/>
       </w:pPr>
+      <w:rPr/>
     </w:lvl>
     <w:lvl w:ilvl="8">
       <w:start w:val="1"/>
@@ -2887,6 +2920,7 @@
         </w:tabs>
         <w:ind w:start="3600" w:hanging="360"/>
       </w:pPr>
+      <w:rPr/>
     </w:lvl>
   </w:abstractNum>
   <w:abstractNum w:abstractNumId="7">
@@ -3037,7 +3071,7 @@
   <w:docDefaults>
     <w:rPrDefault>
       <w:rPr>
-        <w:rFonts w:ascii="Cambria" w:hAnsi="Cambria" w:eastAsia="ＭＳ 明朝" w:cs="" w:asciiTheme="minorHAnsi" w:cstheme="minorBidi" w:eastAsiaTheme="minorEastAsia" w:hAnsiTheme="minorHAnsi"/>
+        <w:rFonts w:ascii="Cambria" w:hAnsi="Cambria" w:eastAsia="" w:cs="" w:asciiTheme="minorHAnsi" w:cstheme="minorBidi" w:eastAsiaTheme="minorEastAsia" w:hAnsiTheme="minorHAnsi"/>
         <w:sz w:val="22"/>
         <w:szCs w:val="22"/>
         <w:lang w:val="en-US" w:eastAsia="en-US" w:bidi="ar-SA"/>
@@ -3194,6 +3228,7 @@
     <w:rsid w:val="00fc693f"/>
     <w:pPr>
       <w:widowControl/>
+      <w:suppressAutoHyphens w:val="true"/>
       <w:bidi w:val="0"/>
       <w:spacing w:lineRule="auto" w:line="276" w:before="0" w:after="40"/>
       <w:jc w:val="start"/>
@@ -3222,7 +3257,7 @@
       <w:outlineLvl w:val="0"/>
     </w:pPr>
     <w:rPr>
-      <w:rFonts w:ascii="Calibri" w:hAnsi="Calibri" w:eastAsia="ＭＳ ゴシック" w:cs="" w:asciiTheme="majorHAnsi" w:cstheme="majorBidi" w:eastAsiaTheme="majorEastAsia" w:hAnsiTheme="majorHAnsi"/>
+      <w:rFonts w:ascii="Calibri" w:hAnsi="Calibri" w:eastAsia="" w:cs="" w:asciiTheme="majorHAnsi" w:cstheme="majorBidi" w:eastAsiaTheme="majorEastAsia" w:hAnsiTheme="majorHAnsi"/>
       <w:b/>
       <w:bCs/>
       <w:color w:themeColor="accent1" w:themeShade="bf" w:val="365F91"/>
@@ -3246,7 +3281,7 @@
       <w:outlineLvl w:val="1"/>
     </w:pPr>
     <w:rPr>
-      <w:rFonts w:ascii="Calibri" w:hAnsi="Calibri" w:eastAsia="ＭＳ ゴシック" w:cs="" w:asciiTheme="majorHAnsi" w:cstheme="majorBidi" w:eastAsiaTheme="majorEastAsia" w:hAnsiTheme="majorHAnsi"/>
+      <w:rFonts w:ascii="Calibri" w:hAnsi="Calibri" w:eastAsia="" w:cs="" w:asciiTheme="majorHAnsi" w:cstheme="majorBidi" w:eastAsiaTheme="majorEastAsia" w:hAnsiTheme="majorHAnsi"/>
       <w:b/>
       <w:bCs/>
       <w:color w:themeColor="accent1" w:val="4F81BD"/>
@@ -3270,7 +3305,7 @@
       <w:outlineLvl w:val="2"/>
     </w:pPr>
     <w:rPr>
-      <w:rFonts w:ascii="Calibri" w:hAnsi="Calibri" w:eastAsia="ＭＳ ゴシック" w:cs="" w:asciiTheme="majorHAnsi" w:cstheme="majorBidi" w:eastAsiaTheme="majorEastAsia" w:hAnsiTheme="majorHAnsi"/>
+      <w:rFonts w:ascii="Calibri" w:hAnsi="Calibri" w:eastAsia="" w:cs="" w:asciiTheme="majorHAnsi" w:cstheme="majorBidi" w:eastAsiaTheme="majorEastAsia" w:hAnsiTheme="majorHAnsi"/>
       <w:b/>
       <w:bCs/>
       <w:color w:themeColor="accent1" w:val="4F81BD"/>
@@ -3293,7 +3328,7 @@
       <w:outlineLvl w:val="3"/>
     </w:pPr>
     <w:rPr>
-      <w:rFonts w:ascii="Calibri" w:hAnsi="Calibri" w:eastAsia="ＭＳ ゴシック" w:cs="" w:asciiTheme="majorHAnsi" w:cstheme="majorBidi" w:eastAsiaTheme="majorEastAsia" w:hAnsiTheme="majorHAnsi"/>
+      <w:rFonts w:ascii="Calibri" w:hAnsi="Calibri" w:eastAsia="" w:cs="" w:asciiTheme="majorHAnsi" w:cstheme="majorBidi" w:eastAsiaTheme="majorEastAsia" w:hAnsiTheme="majorHAnsi"/>
       <w:b/>
       <w:bCs/>
       <w:i/>
@@ -3318,7 +3353,7 @@
       <w:outlineLvl w:val="4"/>
     </w:pPr>
     <w:rPr>
-      <w:rFonts w:ascii="Calibri" w:hAnsi="Calibri" w:eastAsia="ＭＳ ゴシック" w:cs="" w:asciiTheme="majorHAnsi" w:cstheme="majorBidi" w:eastAsiaTheme="majorEastAsia" w:hAnsiTheme="majorHAnsi"/>
+      <w:rFonts w:ascii="Calibri" w:hAnsi="Calibri" w:eastAsia="" w:cs="" w:asciiTheme="majorHAnsi" w:cstheme="majorBidi" w:eastAsiaTheme="majorEastAsia" w:hAnsiTheme="majorHAnsi"/>
       <w:color w:themeColor="accent1" w:themeShade="7f" w:val="243F60"/>
     </w:rPr>
   </w:style>
@@ -3339,7 +3374,7 @@
       <w:outlineLvl w:val="5"/>
     </w:pPr>
     <w:rPr>
-      <w:rFonts w:ascii="Calibri" w:hAnsi="Calibri" w:eastAsia="ＭＳ ゴシック" w:cs="" w:asciiTheme="majorHAnsi" w:cstheme="majorBidi" w:eastAsiaTheme="majorEastAsia" w:hAnsiTheme="majorHAnsi"/>
+      <w:rFonts w:ascii="Calibri" w:hAnsi="Calibri" w:eastAsia="" w:cs="" w:asciiTheme="majorHAnsi" w:cstheme="majorBidi" w:eastAsiaTheme="majorEastAsia" w:hAnsiTheme="majorHAnsi"/>
       <w:i/>
       <w:iCs/>
       <w:color w:themeColor="accent1" w:themeShade="7f" w:val="243F60"/>
@@ -3362,7 +3397,7 @@
       <w:outlineLvl w:val="6"/>
     </w:pPr>
     <w:rPr>
-      <w:rFonts w:ascii="Calibri" w:hAnsi="Calibri" w:eastAsia="ＭＳ ゴシック" w:cs="" w:asciiTheme="majorHAnsi" w:cstheme="majorBidi" w:eastAsiaTheme="majorEastAsia" w:hAnsiTheme="majorHAnsi"/>
+      <w:rFonts w:ascii="Calibri" w:hAnsi="Calibri" w:eastAsia="" w:cs="" w:asciiTheme="majorHAnsi" w:cstheme="majorBidi" w:eastAsiaTheme="majorEastAsia" w:hAnsiTheme="majorHAnsi"/>
       <w:i/>
       <w:iCs/>
       <w:color w:themeColor="text1" w:themeTint="bf" w:val="404040"/>
@@ -3385,7 +3420,7 @@
       <w:outlineLvl w:val="7"/>
     </w:pPr>
     <w:rPr>
-      <w:rFonts w:ascii="Calibri" w:hAnsi="Calibri" w:eastAsia="ＭＳ ゴシック" w:cs="" w:asciiTheme="majorHAnsi" w:cstheme="majorBidi" w:eastAsiaTheme="majorEastAsia" w:hAnsiTheme="majorHAnsi"/>
+      <w:rFonts w:ascii="Calibri" w:hAnsi="Calibri" w:eastAsia="" w:cs="" w:asciiTheme="majorHAnsi" w:cstheme="majorBidi" w:eastAsiaTheme="majorEastAsia" w:hAnsiTheme="majorHAnsi"/>
       <w:color w:themeColor="accent1" w:val="4F81BD"/>
       <w:sz w:val="20"/>
       <w:szCs w:val="20"/>
@@ -3408,7 +3443,7 @@
       <w:outlineLvl w:val="8"/>
     </w:pPr>
     <w:rPr>
-      <w:rFonts w:ascii="Calibri" w:hAnsi="Calibri" w:eastAsia="ＭＳ ゴシック" w:cs="" w:asciiTheme="majorHAnsi" w:cstheme="majorBidi" w:eastAsiaTheme="majorEastAsia" w:hAnsiTheme="majorHAnsi"/>
+      <w:rFonts w:ascii="Calibri" w:hAnsi="Calibri" w:eastAsia="" w:cs="" w:asciiTheme="majorHAnsi" w:cstheme="majorBidi" w:eastAsiaTheme="majorEastAsia" w:hAnsiTheme="majorHAnsi"/>
       <w:i/>
       <w:iCs/>
       <w:color w:themeColor="text1" w:themeTint="bf" w:val="404040"/>
@@ -3450,7 +3485,7 @@
     <w:qFormat/>
     <w:rsid w:val="00fc693f"/>
     <w:rPr>
-      <w:rFonts w:ascii="Calibri" w:hAnsi="Calibri" w:eastAsia="ＭＳ ゴシック" w:cs="" w:asciiTheme="majorHAnsi" w:cstheme="majorBidi" w:eastAsiaTheme="majorEastAsia" w:hAnsiTheme="majorHAnsi"/>
+      <w:rFonts w:ascii="Calibri" w:hAnsi="Calibri" w:eastAsia="" w:cs="" w:asciiTheme="majorHAnsi" w:cstheme="majorBidi" w:eastAsiaTheme="majorEastAsia" w:hAnsiTheme="majorHAnsi"/>
       <w:b/>
       <w:bCs/>
       <w:color w:themeColor="accent1" w:themeShade="bf" w:val="365F91"/>
@@ -3466,7 +3501,7 @@
     <w:qFormat/>
     <w:rsid w:val="00fc693f"/>
     <w:rPr>
-      <w:rFonts w:ascii="Calibri" w:hAnsi="Calibri" w:eastAsia="ＭＳ ゴシック" w:cs="" w:asciiTheme="majorHAnsi" w:cstheme="majorBidi" w:eastAsiaTheme="majorEastAsia" w:hAnsiTheme="majorHAnsi"/>
+      <w:rFonts w:ascii="Calibri" w:hAnsi="Calibri" w:eastAsia="" w:cs="" w:asciiTheme="majorHAnsi" w:cstheme="majorBidi" w:eastAsiaTheme="majorEastAsia" w:hAnsiTheme="majorHAnsi"/>
       <w:b/>
       <w:bCs/>
       <w:color w:themeColor="accent1" w:val="4F81BD"/>
@@ -3482,7 +3517,7 @@
     <w:qFormat/>
     <w:rsid w:val="00fc693f"/>
     <w:rPr>
-      <w:rFonts w:ascii="Calibri" w:hAnsi="Calibri" w:eastAsia="ＭＳ ゴシック" w:cs="" w:asciiTheme="majorHAnsi" w:cstheme="majorBidi" w:eastAsiaTheme="majorEastAsia" w:hAnsiTheme="majorHAnsi"/>
+      <w:rFonts w:ascii="Calibri" w:hAnsi="Calibri" w:eastAsia="" w:cs="" w:asciiTheme="majorHAnsi" w:cstheme="majorBidi" w:eastAsiaTheme="majorEastAsia" w:hAnsiTheme="majorHAnsi"/>
       <w:b/>
       <w:bCs/>
       <w:color w:themeColor="accent1" w:val="4F81BD"/>
@@ -3496,7 +3531,7 @@
     <w:qFormat/>
     <w:rsid w:val="00fc693f"/>
     <w:rPr>
-      <w:rFonts w:ascii="Calibri" w:hAnsi="Calibri" w:eastAsia="ＭＳ ゴシック" w:cs="" w:asciiTheme="majorHAnsi" w:cstheme="majorBidi" w:eastAsiaTheme="majorEastAsia" w:hAnsiTheme="majorHAnsi"/>
+      <w:rFonts w:ascii="Calibri" w:hAnsi="Calibri" w:eastAsia="" w:cs="" w:asciiTheme="majorHAnsi" w:cstheme="majorBidi" w:eastAsiaTheme="majorEastAsia" w:hAnsiTheme="majorHAnsi"/>
       <w:color w:themeColor="text2" w:themeShade="bf" w:val="17365D"/>
       <w:spacing w:val="5"/>
       <w:kern w:val="2"/>
@@ -3512,7 +3547,7 @@
     <w:qFormat/>
     <w:rsid w:val="00fc693f"/>
     <w:rPr>
-      <w:rFonts w:ascii="Calibri" w:hAnsi="Calibri" w:eastAsia="ＭＳ ゴシック" w:cs="" w:asciiTheme="majorHAnsi" w:cstheme="majorBidi" w:eastAsiaTheme="majorEastAsia" w:hAnsiTheme="majorHAnsi"/>
+      <w:rFonts w:ascii="Calibri" w:hAnsi="Calibri" w:eastAsia="" w:cs="" w:asciiTheme="majorHAnsi" w:cstheme="majorBidi" w:eastAsiaTheme="majorEastAsia" w:hAnsiTheme="majorHAnsi"/>
       <w:i/>
       <w:iCs/>
       <w:color w:themeColor="accent1" w:val="4F81BD"/>
@@ -3585,7 +3620,7 @@
     <w:qFormat/>
     <w:rsid w:val="00fc693f"/>
     <w:rPr>
-      <w:rFonts w:ascii="Calibri" w:hAnsi="Calibri" w:eastAsia="ＭＳ ゴシック" w:cs="" w:asciiTheme="majorHAnsi" w:cstheme="majorBidi" w:eastAsiaTheme="majorEastAsia" w:hAnsiTheme="majorHAnsi"/>
+      <w:rFonts w:ascii="Calibri" w:hAnsi="Calibri" w:eastAsia="" w:cs="" w:asciiTheme="majorHAnsi" w:cstheme="majorBidi" w:eastAsiaTheme="majorEastAsia" w:hAnsiTheme="majorHAnsi"/>
       <w:b/>
       <w:bCs/>
       <w:i/>
@@ -3602,7 +3637,7 @@
     <w:qFormat/>
     <w:rsid w:val="00fc693f"/>
     <w:rPr>
-      <w:rFonts w:ascii="Calibri" w:hAnsi="Calibri" w:eastAsia="ＭＳ ゴシック" w:cs="" w:asciiTheme="majorHAnsi" w:cstheme="majorBidi" w:eastAsiaTheme="majorEastAsia" w:hAnsiTheme="majorHAnsi"/>
+      <w:rFonts w:ascii="Calibri" w:hAnsi="Calibri" w:eastAsia="" w:cs="" w:asciiTheme="majorHAnsi" w:cstheme="majorBidi" w:eastAsiaTheme="majorEastAsia" w:hAnsiTheme="majorHAnsi"/>
       <w:color w:themeColor="accent1" w:themeShade="7f" w:val="243F60"/>
     </w:rPr>
   </w:style>
@@ -3615,7 +3650,7 @@
     <w:qFormat/>
     <w:rsid w:val="00fc693f"/>
     <w:rPr>
-      <w:rFonts w:ascii="Calibri" w:hAnsi="Calibri" w:eastAsia="ＭＳ ゴシック" w:cs="" w:asciiTheme="majorHAnsi" w:cstheme="majorBidi" w:eastAsiaTheme="majorEastAsia" w:hAnsiTheme="majorHAnsi"/>
+      <w:rFonts w:ascii="Calibri" w:hAnsi="Calibri" w:eastAsia="" w:cs="" w:asciiTheme="majorHAnsi" w:cstheme="majorBidi" w:eastAsiaTheme="majorEastAsia" w:hAnsiTheme="majorHAnsi"/>
       <w:i/>
       <w:iCs/>
       <w:color w:themeColor="accent1" w:themeShade="7f" w:val="243F60"/>
@@ -3630,7 +3665,7 @@
     <w:qFormat/>
     <w:rsid w:val="00fc693f"/>
     <w:rPr>
-      <w:rFonts w:ascii="Calibri" w:hAnsi="Calibri" w:eastAsia="ＭＳ ゴシック" w:cs="" w:asciiTheme="majorHAnsi" w:cstheme="majorBidi" w:eastAsiaTheme="majorEastAsia" w:hAnsiTheme="majorHAnsi"/>
+      <w:rFonts w:ascii="Calibri" w:hAnsi="Calibri" w:eastAsia="" w:cs="" w:asciiTheme="majorHAnsi" w:cstheme="majorBidi" w:eastAsiaTheme="majorEastAsia" w:hAnsiTheme="majorHAnsi"/>
       <w:i/>
       <w:iCs/>
       <w:color w:themeColor="text1" w:themeTint="bf" w:val="404040"/>
@@ -3645,7 +3680,7 @@
     <w:qFormat/>
     <w:rsid w:val="00fc693f"/>
     <w:rPr>
-      <w:rFonts w:ascii="Calibri" w:hAnsi="Calibri" w:eastAsia="ＭＳ ゴシック" w:cs="" w:asciiTheme="majorHAnsi" w:cstheme="majorBidi" w:eastAsiaTheme="majorEastAsia" w:hAnsiTheme="majorHAnsi"/>
+      <w:rFonts w:ascii="Calibri" w:hAnsi="Calibri" w:eastAsia="" w:cs="" w:asciiTheme="majorHAnsi" w:cstheme="majorBidi" w:eastAsiaTheme="majorEastAsia" w:hAnsiTheme="majorHAnsi"/>
       <w:color w:themeColor="accent1" w:val="4F81BD"/>
       <w:sz w:val="20"/>
       <w:szCs w:val="20"/>
@@ -3660,7 +3695,7 @@
     <w:qFormat/>
     <w:rsid w:val="00fc693f"/>
     <w:rPr>
-      <w:rFonts w:ascii="Calibri" w:hAnsi="Calibri" w:eastAsia="ＭＳ ゴシック" w:cs="" w:asciiTheme="majorHAnsi" w:cstheme="majorBidi" w:eastAsiaTheme="majorEastAsia" w:hAnsiTheme="majorHAnsi"/>
+      <w:rFonts w:ascii="Calibri" w:hAnsi="Calibri" w:eastAsia="" w:cs="" w:asciiTheme="majorHAnsi" w:cstheme="majorBidi" w:eastAsiaTheme="majorEastAsia" w:hAnsiTheme="majorHAnsi"/>
       <w:i/>
       <w:iCs/>
       <w:color w:themeColor="text1" w:themeTint="bf" w:val="404040"/>
@@ -3890,12 +3925,13 @@
     <w:rsid w:val="00fc693f"/>
     <w:pPr>
       <w:widowControl/>
+      <w:suppressAutoHyphens w:val="true"/>
       <w:bidi w:val="0"/>
       <w:spacing w:lineRule="auto" w:line="240" w:before="0" w:after="0"/>
       <w:jc w:val="start"/>
     </w:pPr>
     <w:rPr>
-      <w:rFonts w:ascii="Cambria" w:hAnsi="Cambria" w:eastAsia="ＭＳ 明朝" w:cs="" w:asciiTheme="minorHAnsi" w:cstheme="minorBidi" w:eastAsiaTheme="minorEastAsia" w:hAnsiTheme="minorHAnsi"/>
+      <w:rFonts w:ascii="Cambria" w:hAnsi="Cambria" w:eastAsia="" w:cs="" w:asciiTheme="minorHAnsi" w:cstheme="minorBidi" w:eastAsiaTheme="minorEastAsia" w:hAnsiTheme="minorHAnsi"/>
       <w:color w:val="auto"/>
       <w:kern w:val="0"/>
       <w:sz w:val="22"/>
@@ -3919,7 +3955,7 @@
       <w:contextualSpacing/>
     </w:pPr>
     <w:rPr>
-      <w:rFonts w:ascii="Calibri" w:hAnsi="Calibri" w:eastAsia="ＭＳ ゴシック" w:cs="" w:asciiTheme="majorHAnsi" w:cstheme="majorBidi" w:eastAsiaTheme="majorEastAsia" w:hAnsiTheme="majorHAnsi"/>
+      <w:rFonts w:ascii="Calibri" w:hAnsi="Calibri" w:eastAsia="" w:cs="" w:asciiTheme="majorHAnsi" w:cstheme="majorBidi" w:eastAsiaTheme="majorEastAsia" w:hAnsiTheme="majorHAnsi"/>
       <w:color w:themeColor="text2" w:themeShade="bf" w:val="17365D"/>
       <w:spacing w:val="5"/>
       <w:kern w:val="2"/>
@@ -3937,7 +3973,7 @@
     <w:rsid w:val="00fc693f"/>
     <w:pPr/>
     <w:rPr>
-      <w:rFonts w:ascii="Calibri" w:hAnsi="Calibri" w:eastAsia="ＭＳ ゴシック" w:cs="" w:asciiTheme="majorHAnsi" w:cstheme="majorBidi" w:eastAsiaTheme="majorEastAsia" w:hAnsiTheme="majorHAnsi"/>
+      <w:rFonts w:ascii="Calibri" w:hAnsi="Calibri" w:eastAsia="" w:cs="" w:asciiTheme="majorHAnsi" w:cstheme="majorBidi" w:eastAsiaTheme="majorEastAsia" w:hAnsiTheme="majorHAnsi"/>
       <w:i/>
       <w:iCs/>
       <w:color w:themeColor="accent1" w:val="4F81BD"/>
@@ -4170,12 +4206,13 @@
         <w:tab w:val="left" w:pos="3456" w:leader="none"/>
         <w:tab w:val="left" w:pos="4032" w:leader="none"/>
       </w:tabs>
+      <w:suppressAutoHyphens w:val="true"/>
       <w:bidi w:val="0"/>
       <w:spacing w:lineRule="auto" w:line="276" w:before="0" w:after="200"/>
       <w:jc w:val="start"/>
     </w:pPr>
     <w:rPr>
-      <w:rFonts w:ascii="Courier" w:hAnsi="Courier" w:eastAsia="ＭＳ 明朝" w:cs="" w:cstheme="minorBidi" w:eastAsiaTheme="minorEastAsia"/>
+      <w:rFonts w:ascii="Courier" w:hAnsi="Courier" w:eastAsia="" w:cs="" w:cstheme="minorBidi" w:eastAsiaTheme="minorEastAsia"/>
       <w:color w:val="auto"/>
       <w:kern w:val="0"/>
       <w:sz w:val="20"/>
@@ -7373,7 +7410,6 @@
       <w:pPr>
         <w:spacing w:before="0" w:after="0" w:line="240" w:lineRule="auto"/>
       </w:pPr>
-      <w:rPr/>
       <w:tblPr/>
       <w:tcPr>
         <w:tcBorders>
@@ -7519,7 +7555,6 @@
       <w:pPr>
         <w:spacing w:before="0" w:after="0" w:line="240" w:lineRule="auto"/>
       </w:pPr>
-      <w:rPr/>
       <w:tblPr/>
       <w:tcPr>
         <w:tcBorders>
@@ -7665,7 +7700,6 @@
       <w:pPr>
         <w:spacing w:before="0" w:after="0" w:line="240" w:lineRule="auto"/>
       </w:pPr>
-      <w:rPr/>
       <w:tblPr/>
       <w:tcPr>
         <w:tcBorders>
@@ -7811,7 +7845,6 @@
       <w:pPr>
         <w:spacing w:before="0" w:after="0" w:line="240" w:lineRule="auto"/>
       </w:pPr>
-      <w:rPr/>
       <w:tblPr/>
       <w:tcPr>
         <w:tcBorders>
@@ -7957,7 +7990,6 @@
       <w:pPr>
         <w:spacing w:before="0" w:after="0" w:line="240" w:lineRule="auto"/>
       </w:pPr>
-      <w:rPr/>
       <w:tblPr/>
       <w:tcPr>
         <w:tcBorders>
@@ -8103,7 +8135,6 @@
       <w:pPr>
         <w:spacing w:before="0" w:after="0" w:line="240" w:lineRule="auto"/>
       </w:pPr>
-      <w:rPr/>
       <w:tblPr/>
       <w:tcPr>
         <w:tcBorders>
@@ -8249,7 +8280,6 @@
       <w:pPr>
         <w:spacing w:before="0" w:after="0" w:line="240" w:lineRule="auto"/>
       </w:pPr>
-      <w:rPr/>
       <w:tblPr/>
       <w:tcPr>
         <w:tcBorders>

</xml_diff>